<commit_message>
Agrega fuente y autor del dataset (Kaggle)
</commit_message>
<xml_diff>
--- a/reports/TP_Grupo2_DMT_202602.docx
+++ b/reports/TP_Grupo2_DMT_202602.docx
@@ -1687,15 +1687,15 @@
           <w:sz w:val="24"/>
           <w:szCs w:val="24"/>
         </w:rPr>
-        <w:t xml:space="preserve">Thyroid Cancer Risk Prediction Dataset</w:t>
-      </w:r>
-      <w:r>
-        <w:rPr>
-          <w:rFonts w:ascii="Arial" w:cs="Arial" w:eastAsia="Arial" w:hAnsi="Arial"/>
-          <w:sz w:val="24"/>
-          <w:szCs w:val="24"/>
-        </w:rPr>
-        <w:t xml:space="preserve"> (archivo thyroid_cancer_risk_data.csv). Se trata de un dataset publicado con fines educativos y de investigación que reúne información demográfica, antecedentes, perfil hormonal y características del nódulo tiroideo. [COMPLETAR: autor y URL exacta de la página de Kaggle].</w:t>
+        <w:t xml:space="preserve">Thyroid Cancer Risk Dataset</w:t>
+      </w:r>
+      <w:r>
+        <w:rPr>
+          <w:rFonts w:ascii="Arial" w:cs="Arial" w:eastAsia="Arial" w:hAnsi="Arial"/>
+          <w:sz w:val="24"/>
+          <w:szCs w:val="24"/>
+        </w:rPr>
+        <w:t xml:space="preserve">, publicado por Bhargav Chirumamilla en 2025 (archivo thyroid_cancer_risk_data.csv). Se trata de un dataset publicado con fines educativos y de investigación que reúne información demográfica, antecedentes, perfil hormonal y características del nódulo tiroideo. Disponible en: https://www.kaggle.com/datasets/bhargavchirumamilla/thyroid-cancer-risk-dataset</w:t>
       </w:r>
     </w:p>
     <w:p>
@@ -3652,7 +3652,7 @@
           <w:sz w:val="24"/>
           <w:szCs w:val="24"/>
         </w:rPr>
-        <w:t xml:space="preserve">El dataset es de acceso público en Kaggle y se utiliza exclusivamente con fines académicos. [COMPLETAR: licencia exacta indicada en la página del dataset, por ejemplo CC0, CC BY 4.0 u otra]. Los datos no contienen información personal identificable (el Patient_ID es un correlativo).</w:t>
+        <w:t xml:space="preserve">El dataset es de acceso público en Kaggle y se utiliza exclusivamente con fines académicos. La página del dataset no declara una licencia explícita en sus metadatos públicos, por lo que se usa únicamente con fines académicos y citando la fuente. Los datos no contienen información personal identificable (el Patient_ID es un correlativo).</w:t>
       </w:r>
     </w:p>
     <w:p>
@@ -12463,7 +12463,7 @@
           <w:sz w:val="24"/>
           <w:szCs w:val="24"/>
         </w:rPr>
-        <w:t xml:space="preserve">•  Confirmar la autoría y licencia del dataset.</w:t>
+        <w:t xml:space="preserve">•  Confirmar la licencia del dataset con su autor (no está declarada en Kaggle).</w:t>
       </w:r>
     </w:p>
     <w:p>
@@ -14339,7 +14339,7 @@
           <w:sz w:val="24"/>
           <w:szCs w:val="24"/>
         </w:rPr>
-        <w:t xml:space="preserve">Kaggle. Thyroid Cancer Risk Prediction Dataset. [COMPLETAR: autor, año y URL].</w:t>
+        <w:t xml:space="preserve">Chirumamilla, B. (2025). Thyroid Cancer Risk Dataset [Conjunto de datos]. Kaggle. https://www.kaggle.com/datasets/bhargavchirumamilla/thyroid-cancer-risk-dataset</w:t>
       </w:r>
     </w:p>
     <w:sectPr>

</xml_diff>